<commit_message>
Report: team details, existing-solutions research, Whisper figure, Word version
- Title block with university, programme, subject, lecturer, students and
  class (from the presentation), plus the Hugging Face model link.
- Section 2: verified that YouTube auto-captions list "Central Khmer" and
  that Google Cloud Speech-to-Text supports km-KH (Chirp 2/3), with sources;
  new Table 1b of community Khmer ASR models and their reported results,
  noting Qwen3-ASR-0.6B-Khmer (~700 h) is far stronger but not comparable.
- Section 4.1: new Figure 1, the Whisper-small encoder-decoder as used here
  (docs/figures/build_whisper_architecture.py); system architecture is now
  Figure 2. References 8-10 added; author-only notes removed.
- docs/Final_Report.docx built from report.md by docs/build_report_docx.js
  (title page, contents, tables, figures); the old draft's title page now
  has the team details.

Co-Authored-By: Claude Opus 5.5 <noreply@anthropic.com>
</commit_message>
<xml_diff>
--- a/docs/Final_Report_Draft.docx
+++ b/docs/Final_Report_Draft.docx
@@ -58,58 +58,110 @@
       </w:pPr>
       <w:r>
         <w:rPr>
+          <w:b/>
+          <w:bCs/>
           <w:sz w:val="24"/>
           <w:szCs w:val="24"/>
-          <w:highlight w:val="yellow"/>
-        </w:rPr>
-        <w:t xml:space="preserve">[Your name]</w:t>
-      </w:r>
+        </w:rPr>
+        <w:t xml:space="preserve">Royal University of Phnom Penh</w:t>
+      </w:r>
+    </w:p>
+    <w:p>
+      <w:pPr>
+        <w:jc w:val="center"/>
+      </w:pPr>
       <w:r>
         <w:rPr>
           <w:sz w:val="24"/>
           <w:szCs w:val="24"/>
         </w:rPr>
-        <w:t xml:space="preserve">  ·  </w:t>
-      </w:r>
-      <w:r>
-        <w:rPr>
+        <w:t xml:space="preserve">Master of Science in Data Science and Engineering</w:t>
+      </w:r>
+    </w:p>
+    <w:p>
+      <w:pPr>
+        <w:spacing w:before="240"/>
+        <w:jc w:val="center"/>
+      </w:pPr>
+      <w:r>
+        <w:rPr>
+          <w:b/>
+          <w:bCs/>
           <w:sz w:val="24"/>
           <w:szCs w:val="24"/>
-          <w:highlight w:val="yellow"/>
-        </w:rPr>
-        <w:t xml:space="preserve">[Student ID]</w:t>
-      </w:r>
-    </w:p>
-    <w:p>
-      <w:pPr>
-        <w:jc w:val="center"/>
-      </w:pPr>
+        </w:rPr>
+        <w:t xml:space="preserve">Subject: </w:t>
+      </w:r>
       <w:r>
         <w:rPr>
           <w:sz w:val="24"/>
           <w:szCs w:val="24"/>
-          <w:highlight w:val="yellow"/>
-        </w:rPr>
-        <w:t xml:space="preserve">[Course name]</w:t>
-      </w:r>
-      <w:r>
-        <w:rPr>
+        </w:rPr>
+        <w:t xml:space="preserve">Introduction to Large Language Models</w:t>
+      </w:r>
+    </w:p>
+    <w:p>
+      <w:pPr>
+        <w:jc w:val="center"/>
+      </w:pPr>
+      <w:r>
+        <w:rPr>
+          <w:b/>
+          <w:bCs/>
           <w:sz w:val="24"/>
           <w:szCs w:val="24"/>
         </w:rPr>
-        <w:t xml:space="preserve">  ·  Instructor: Chen Sovann</w:t>
-      </w:r>
-    </w:p>
-    <w:p>
-      <w:pPr>
-        <w:jc w:val="center"/>
-      </w:pPr>
+        <w:t xml:space="preserve">Lecturer: </w:t>
+      </w:r>
       <w:r>
         <w:rPr>
           <w:sz w:val="24"/>
           <w:szCs w:val="24"/>
         </w:rPr>
-        <w:t xml:space="preserve">October 2026</w:t>
+        <w:t xml:space="preserve">Dr. Chen Sovann</w:t>
+      </w:r>
+    </w:p>
+    <w:p>
+      <w:pPr>
+        <w:spacing w:before="240"/>
+        <w:jc w:val="center"/>
+      </w:pPr>
+      <w:r>
+        <w:rPr>
+          <w:b/>
+          <w:bCs/>
+          <w:sz w:val="24"/>
+          <w:szCs w:val="24"/>
+        </w:rPr>
+        <w:t xml:space="preserve">Students: </w:t>
+      </w:r>
+      <w:r>
+        <w:rPr>
+          <w:sz w:val="24"/>
+          <w:szCs w:val="24"/>
+        </w:rPr>
+        <w:t xml:space="preserve">Sem Chitra, Sar Sakal, Earn Pisey, Sam Reaksmey</w:t>
+      </w:r>
+    </w:p>
+    <w:p>
+      <w:pPr>
+        <w:jc w:val="center"/>
+      </w:pPr>
+      <w:r>
+        <w:rPr>
+          <w:b/>
+          <w:bCs/>
+          <w:sz w:val="24"/>
+          <w:szCs w:val="24"/>
+        </w:rPr>
+        <w:t xml:space="preserve">Class: </w:t>
+      </w:r>
+      <w:r>
+        <w:rPr>
+          <w:sz w:val="24"/>
+          <w:szCs w:val="24"/>
+        </w:rPr>
+        <w:t xml:space="preserve">MDSE Cohort 3, October 2026</w:t>
       </w:r>
     </w:p>
     <w:p>
@@ -162,7 +214,7 @@
           <w:sz w:val="18"/>
           <w:szCs w:val="18"/>
         </w:rPr>
-        <w:t xml:space="preserve"> is a placeholder to fill in before submission (mostly results from the Kaggle evaluate run).</w:t>
+        <w:t xml:space="preserve"> is a placeholder to fill in before submission (the latest version of the report is docs/report.md in the repository).</w:t>
       </w:r>
     </w:p>
     <w:p>

</xml_diff>